<commit_message>
ops: harden Argos teaming response packet
</commit_message>
<xml_diff>
--- a/grant_submissions/ONC_ARGOS_20260730/output/ARGOS_PARTNER_FIRST_CAPABILITY_RESPONSE_DRAFT.docx
+++ b/grant_submissions/ONC_ARGOS_20260730/output/ARGOS_PARTNER_FIRST_CAPABILITY_RESPONSE_DRAFT.docx
@@ -84,7 +84,7 @@
           <w:color w:val="17222B"/>
           <w:sz w:val="24"/>
         </w:rPr>
-        <w:t>PARTNER-FIRST CAPABILITY STATEMENT</w:t>
+        <w:t>MARKET RESEARCH CAPABILITY STATEMENT</w:t>
       </w:r>
     </w:p>
     <w:p>
@@ -659,6 +659,60 @@
                 <w:rFonts w:ascii="Times New Roman" w:hAnsi="Times New Roman"/>
                 <w:sz w:val="24"/>
               </w:rPr>
+              <w:t>Public reviewer surface</w:t>
+            </w:r>
+          </w:p>
+        </w:tc>
+        <w:tc>
+          <w:tcPr>
+            <w:tcW w:type="dxa" w:w="4680"/>
+            <w:tcMar>
+              <w:top w:w="90" w:type="dxa"/>
+              <w:start w:w="110" w:type="dxa"/>
+              <w:bottom w:w="90" w:type="dxa"/>
+              <w:end w:w="110" w:type="dxa"/>
+            </w:tcMar>
+            <w:vAlign w:val="center"/>
+            <w:shd w:fill="F9FBFC"/>
+          </w:tcPr>
+          <w:p>
+            <w:pPr>
+              <w:spacing w:after="0" w:line="240" w:lineRule="auto"/>
+            </w:pPr>
+            <w:r>
+              <w:rPr>
+                <w:rFonts w:ascii="Times New Roman" w:hAnsi="Times New Roman"/>
+                <w:sz w:val="24"/>
+              </w:rPr>
+              <w:t>https://lumen-core.ai/</w:t>
+            </w:r>
+          </w:p>
+        </w:tc>
+      </w:tr>
+      <w:tr>
+        <w:trPr>
+          <w:cantSplit w:val="true"/>
+        </w:trPr>
+        <w:tc>
+          <w:tcPr>
+            <w:tcW w:type="dxa" w:w="4680"/>
+            <w:tcMar>
+              <w:top w:w="90" w:type="dxa"/>
+              <w:start w:w="110" w:type="dxa"/>
+              <w:bottom w:w="90" w:type="dxa"/>
+              <w:end w:w="110" w:type="dxa"/>
+            </w:tcMar>
+            <w:vAlign w:val="center"/>
+          </w:tcPr>
+          <w:p>
+            <w:pPr>
+              <w:spacing w:after="0" w:line="240" w:lineRule="auto"/>
+            </w:pPr>
+            <w:r>
+              <w:rPr>
+                <w:rFonts w:ascii="Times New Roman" w:hAnsi="Times New Roman"/>
+                <w:sz w:val="24"/>
+              </w:rPr>
               <w:t>Public evidence repository</w:t>
             </w:r>
           </w:p>
@@ -673,7 +727,6 @@
               <w:end w:w="110" w:type="dxa"/>
             </w:tcMar>
             <w:vAlign w:val="center"/>
-            <w:shd w:fill="F9FBFC"/>
           </w:tcPr>
           <w:p>
             <w:pPr>
@@ -703,6 +756,7 @@
               <w:end w:w="110" w:type="dxa"/>
             </w:tcMar>
             <w:vAlign w:val="center"/>
+            <w:shd w:fill="F9FBFC"/>
           </w:tcPr>
           <w:p>
             <w:pPr>
@@ -727,6 +781,7 @@
               <w:end w:w="110" w:type="dxa"/>
             </w:tcMar>
             <w:vAlign w:val="center"/>
+            <w:shd w:fill="F9FBFC"/>
           </w:tcPr>
           <w:p>
             <w:pPr>
@@ -799,7 +854,7 @@
           <w:i w:val="0"/>
           <w:sz w:val="24"/>
         </w:rPr>
-        <w:t>LumenCore responds to this Sources Sought as a prospective evidence-assurance and deterministic-validation workstream contributor, not as a presently qualified full-scope health IT prime. The public LumenCore repository demonstrates bounded patterns for authorized-source custody, deterministic replay, rule traceability, hash-locked evidence cases, human decision gates, negative-result retention, and reviewer handoff.</w:t>
+        <w:t>LumenCore offers Project Argos a bounded evidence-assurance and deterministic-validation workstream: authorized-source custody, rule traceability, hash-locked evidence cases, human decision gates, adverse-result retention, and reviewer handoff. These are component capabilities supported by the public LumenCore repository and live reviewer surface.</w:t>
       </w:r>
     </w:p>
     <w:p>
@@ -813,7 +868,7 @@
           <w:i w:val="0"/>
           <w:sz w:val="24"/>
         </w:rPr>
-        <w:t>For Project Argos, those patterns align most directly with requirements traceability, public-source ingestion provenance, deterministic validator orchestration, evidence-case generation, corrective-action retest records, and production handoff documentation. A credible team still requires named FHIR R4/CHPL and ONC Certification Program expertise plus an HHS ATO/FIPS 199/security assessment lead. LumenCore recommends participating under, or alongside, a qualified health IT and federal cybersecurity prime.</w:t>
+        <w:t>For Project Argos, those patterns align most directly with requirements traceability, public-source ingestion provenance, deterministic validator orchestration, evidence-case generation, corrective-action retest records, and production handoff documentation. LumenCore is responding at component level and does not claim presently qualified full-scope health IT prime readiness. A credible team still requires named FHIR R4/CHPL and ONC Certification Program expertise plus an HHS ATO/FIPS 199/security lead.</w:t>
       </w:r>
     </w:p>
     <w:tbl>
@@ -2422,7 +2477,7 @@
           <w:color w:val="17222B"/>
           <w:sz w:val="24"/>
         </w:rPr>
-        <w:t>5. Demonstrated Evidence and Claim Boundaries</w:t>
+        <w:t>5. Component Evidence and Similar-Scope Status</w:t>
       </w:r>
     </w:p>
     <w:p>
@@ -2640,7 +2695,7 @@
                 <w:rFonts w:ascii="Times New Roman" w:hAnsi="Times New Roman"/>
                 <w:sz w:val="24"/>
               </w:rPr>
-              <w:t>Measured public EIA replay</w:t>
+              <w:t>Custody and validation controls</w:t>
             </w:r>
           </w:p>
         </w:tc>
@@ -2664,7 +2719,7 @@
                 <w:rFonts w:ascii="Times New Roman" w:hAnsi="Times New Roman"/>
                 <w:sz w:val="24"/>
               </w:rPr>
-              <w:t>14,704 panel rows; frozen multi-authority holdouts; explicit baseline ranking; negative Kuramoto result retained rather than promoted.</w:t>
+              <w:t>Versioned manifests, SHA-256 receipts, schema checks, duplicate-action locks, and fail-closed gate records support an inspectable evidence workflow.</w:t>
             </w:r>
           </w:p>
         </w:tc>
@@ -2688,7 +2743,7 @@
                 <w:rFonts w:ascii="Times New Roman" w:hAnsi="Times New Roman"/>
                 <w:sz w:val="24"/>
               </w:rPr>
-              <w:t>Grid-demand benchmark only; it demonstrates evidence discipline, not transfer to FHIR, healthcare, compliance, or operational savings.</w:t>
+              <w:t>Control artifacts do not establish health-domain correctness, production authorization, contract performance, or agency acceptance.</w:t>
             </w:r>
           </w:p>
         </w:tc>
@@ -2718,7 +2773,7 @@
                 <w:rFonts w:ascii="Times New Roman" w:hAnsi="Times New Roman"/>
                 <w:sz w:val="24"/>
               </w:rPr>
-              <w:t>Residual-model replay</w:t>
+              <w:t>Adverse-result retention</w:t>
             </w:r>
           </w:p>
         </w:tc>
@@ -2743,7 +2798,7 @@
                 <w:rFonts w:ascii="Times New Roman" w:hAnsi="Times New Roman"/>
                 <w:sz w:val="24"/>
               </w:rPr>
-              <w:t>A residual candidate ranked first on the frozen replay while promotion, coverage, and field-validation gates remained false.</w:t>
+              <w:t>Public records preserve failed promotion gates, negative findings, and unresolved authorities instead of converting them into favorable claims.</w:t>
             </w:r>
           </w:p>
         </w:tc>
@@ -2768,7 +2823,438 @@
                 <w:rFonts w:ascii="Times New Roman" w:hAnsi="Times New Roman"/>
                 <w:sz w:val="24"/>
               </w:rPr>
-              <w:t>Point improvement is not a production or economic claim; prospective and independent gates remain open.</w:t>
+              <w:t>Transparent failure handling is an engineering pattern, not proof of FHIR conformance, regulatory interpretation, or field performance.</w:t>
+            </w:r>
+          </w:p>
+        </w:tc>
+      </w:tr>
+    </w:tbl>
+    <w:p>
+      <w:pPr>
+        <w:spacing w:after="0"/>
+      </w:pPr>
+    </w:p>
+    <w:p>
+      <w:pPr>
+        <w:spacing w:before="0" w:after="120" w:line="240" w:lineRule="auto"/>
+      </w:pPr>
+      <w:r>
+        <w:rPr>
+          <w:rFonts w:ascii="Times New Roman" w:hAnsi="Times New Roman"/>
+          <w:b w:val="0"/>
+          <w:i w:val="0"/>
+          <w:sz w:val="24"/>
+        </w:rPr>
+        <w:t>The notice requests experience of similar scope and complexity. The matrix below distinguishes LumenCore component evidence from qualifications that must come from an authorized team; it does not substitute adjacent technical work for federal health prior performance.</w:t>
+      </w:r>
+    </w:p>
+    <w:tbl>
+      <w:tblPr>
+        <w:tblStyle w:val="TableGrid"/>
+        <w:tblW w:type="dxa" w:w="9360"/>
+        <w:jc w:val="center"/>
+        <w:tblLayout w:type="fixed"/>
+        <w:tblLook w:firstColumn="1" w:firstRow="1" w:lastColumn="0" w:lastRow="0" w:noHBand="0" w:noVBand="1" w:val="04A0"/>
+      </w:tblPr>
+      <w:tblGrid>
+        <w:gridCol w:w="3120"/>
+        <w:gridCol w:w="3120"/>
+        <w:gridCol w:w="3120"/>
+      </w:tblGrid>
+      <w:tr>
+        <w:trPr>
+          <w:tblHeader w:val="true"/>
+          <w:cantSplit w:val="true"/>
+        </w:trPr>
+        <w:tc>
+          <w:tcPr>
+            <w:tcW w:type="dxa" w:w="2520"/>
+            <w:shd w:fill="EAF5F8"/>
+            <w:tcMar>
+              <w:top w:w="90" w:type="dxa"/>
+              <w:start w:w="110" w:type="dxa"/>
+              <w:bottom w:w="90" w:type="dxa"/>
+              <w:end w:w="110" w:type="dxa"/>
+            </w:tcMar>
+            <w:vAlign w:val="center"/>
+          </w:tcPr>
+          <w:p>
+            <w:pPr>
+              <w:spacing w:after="0" w:line="240" w:lineRule="auto"/>
+            </w:pPr>
+            <w:r>
+              <w:rPr>
+                <w:rFonts w:ascii="Times New Roman" w:hAnsi="Times New Roman"/>
+                <w:b/>
+                <w:sz w:val="24"/>
+              </w:rPr>
+              <w:t>Capability area</w:t>
+            </w:r>
+          </w:p>
+        </w:tc>
+        <w:tc>
+          <w:tcPr>
+            <w:tcW w:type="dxa" w:w="3311"/>
+            <w:shd w:fill="EAF5F8"/>
+            <w:tcMar>
+              <w:top w:w="90" w:type="dxa"/>
+              <w:start w:w="110" w:type="dxa"/>
+              <w:bottom w:w="90" w:type="dxa"/>
+              <w:end w:w="110" w:type="dxa"/>
+            </w:tcMar>
+            <w:vAlign w:val="center"/>
+          </w:tcPr>
+          <w:p>
+            <w:pPr>
+              <w:spacing w:after="0" w:line="240" w:lineRule="auto"/>
+            </w:pPr>
+            <w:r>
+              <w:rPr>
+                <w:rFonts w:ascii="Times New Roman" w:hAnsi="Times New Roman"/>
+                <w:b/>
+                <w:sz w:val="24"/>
+              </w:rPr>
+              <w:t>Present support</w:t>
+            </w:r>
+          </w:p>
+        </w:tc>
+        <w:tc>
+          <w:tcPr>
+            <w:tcW w:type="dxa" w:w="3528"/>
+            <w:shd w:fill="EAF5F8"/>
+            <w:tcMar>
+              <w:top w:w="90" w:type="dxa"/>
+              <w:start w:w="110" w:type="dxa"/>
+              <w:bottom w:w="90" w:type="dxa"/>
+              <w:end w:w="110" w:type="dxa"/>
+            </w:tcMar>
+            <w:vAlign w:val="center"/>
+          </w:tcPr>
+          <w:p>
+            <w:pPr>
+              <w:spacing w:after="0" w:line="240" w:lineRule="auto"/>
+            </w:pPr>
+            <w:r>
+              <w:rPr>
+                <w:rFonts w:ascii="Times New Roman" w:hAnsi="Times New Roman"/>
+                <w:b/>
+                <w:sz w:val="24"/>
+              </w:rPr>
+              <w:t>Acquisition implication</w:t>
+            </w:r>
+          </w:p>
+        </w:tc>
+      </w:tr>
+      <w:tr>
+        <w:trPr>
+          <w:cantSplit w:val="true"/>
+        </w:trPr>
+        <w:tc>
+          <w:tcPr>
+            <w:tcW w:type="dxa" w:w="3120"/>
+            <w:tcMar>
+              <w:top w:w="90" w:type="dxa"/>
+              <w:start w:w="110" w:type="dxa"/>
+              <w:bottom w:w="90" w:type="dxa"/>
+              <w:end w:w="110" w:type="dxa"/>
+            </w:tcMar>
+            <w:vAlign w:val="center"/>
+            <w:shd w:fill="F9FBFC"/>
+          </w:tcPr>
+          <w:p>
+            <w:pPr>
+              <w:spacing w:after="0" w:line="240" w:lineRule="auto"/>
+            </w:pPr>
+            <w:r>
+              <w:rPr>
+                <w:rFonts w:ascii="Times New Roman" w:hAnsi="Times New Roman"/>
+                <w:sz w:val="24"/>
+              </w:rPr>
+              <w:t>Evidence custody, traceability, and deterministic validation</w:t>
+            </w:r>
+          </w:p>
+        </w:tc>
+        <w:tc>
+          <w:tcPr>
+            <w:tcW w:type="dxa" w:w="3120"/>
+            <w:tcMar>
+              <w:top w:w="90" w:type="dxa"/>
+              <w:start w:w="110" w:type="dxa"/>
+              <w:bottom w:w="90" w:type="dxa"/>
+              <w:end w:w="110" w:type="dxa"/>
+            </w:tcMar>
+            <w:vAlign w:val="center"/>
+            <w:shd w:fill="F9FBFC"/>
+          </w:tcPr>
+          <w:p>
+            <w:pPr>
+              <w:spacing w:after="0" w:line="240" w:lineRule="auto"/>
+            </w:pPr>
+            <w:r>
+              <w:rPr>
+                <w:rFonts w:ascii="Times New Roman" w:hAnsi="Times New Roman"/>
+                <w:sz w:val="24"/>
+              </w:rPr>
+              <w:t>Component pattern supported by public code, tests, receipts, and reviewer artifacts.</w:t>
+            </w:r>
+          </w:p>
+        </w:tc>
+        <w:tc>
+          <w:tcPr>
+            <w:tcW w:type="dxa" w:w="3120"/>
+            <w:tcMar>
+              <w:top w:w="90" w:type="dxa"/>
+              <w:start w:w="110" w:type="dxa"/>
+              <w:bottom w:w="90" w:type="dxa"/>
+              <w:end w:w="110" w:type="dxa"/>
+            </w:tcMar>
+            <w:vAlign w:val="center"/>
+            <w:shd w:fill="F9FBFC"/>
+          </w:tcPr>
+          <w:p>
+            <w:pPr>
+              <w:spacing w:after="0" w:line="240" w:lineRule="auto"/>
+            </w:pPr>
+            <w:r>
+              <w:rPr>
+                <w:rFonts w:ascii="Times New Roman" w:hAnsi="Times New Roman"/>
+                <w:sz w:val="24"/>
+              </w:rPr>
+              <w:t>LumenCore can be evaluated for a bounded evidence-assurance workstream.</w:t>
+            </w:r>
+          </w:p>
+        </w:tc>
+      </w:tr>
+      <w:tr>
+        <w:trPr>
+          <w:cantSplit w:val="true"/>
+        </w:trPr>
+        <w:tc>
+          <w:tcPr>
+            <w:tcW w:type="dxa" w:w="3120"/>
+            <w:tcMar>
+              <w:top w:w="90" w:type="dxa"/>
+              <w:start w:w="110" w:type="dxa"/>
+              <w:bottom w:w="90" w:type="dxa"/>
+              <w:end w:w="110" w:type="dxa"/>
+            </w:tcMar>
+            <w:vAlign w:val="center"/>
+          </w:tcPr>
+          <w:p>
+            <w:pPr>
+              <w:spacing w:after="0" w:line="240" w:lineRule="auto"/>
+            </w:pPr>
+            <w:r>
+              <w:rPr>
+                <w:rFonts w:ascii="Times New Roman" w:hAnsi="Times New Roman"/>
+                <w:sz w:val="24"/>
+              </w:rPr>
+              <w:t>FHIR R4, CHPL/Lantern/NPPES, and ONC Certification Program delivery</w:t>
+            </w:r>
+          </w:p>
+        </w:tc>
+        <w:tc>
+          <w:tcPr>
+            <w:tcW w:type="dxa" w:w="3120"/>
+            <w:tcMar>
+              <w:top w:w="90" w:type="dxa"/>
+              <w:start w:w="110" w:type="dxa"/>
+              <w:bottom w:w="90" w:type="dxa"/>
+              <w:end w:w="110" w:type="dxa"/>
+            </w:tcMar>
+            <w:vAlign w:val="center"/>
+          </w:tcPr>
+          <w:p>
+            <w:pPr>
+              <w:spacing w:after="0" w:line="240" w:lineRule="auto"/>
+            </w:pPr>
+            <w:r>
+              <w:rPr>
+                <w:rFonts w:ascii="Times New Roman" w:hAnsi="Times New Roman"/>
+                <w:sz w:val="24"/>
+              </w:rPr>
+              <w:t>No direct LumenCore prior-performance reference is claimed.</w:t>
+            </w:r>
+          </w:p>
+        </w:tc>
+        <w:tc>
+          <w:tcPr>
+            <w:tcW w:type="dxa" w:w="3120"/>
+            <w:tcMar>
+              <w:top w:w="90" w:type="dxa"/>
+              <w:start w:w="110" w:type="dxa"/>
+              <w:bottom w:w="90" w:type="dxa"/>
+              <w:end w:w="110" w:type="dxa"/>
+            </w:tcMar>
+            <w:vAlign w:val="center"/>
+          </w:tcPr>
+          <w:p>
+            <w:pPr>
+              <w:spacing w:after="0" w:line="240" w:lineRule="auto"/>
+            </w:pPr>
+            <w:r>
+              <w:rPr>
+                <w:rFonts w:ascii="Times New Roman" w:hAnsi="Times New Roman"/>
+                <w:sz w:val="24"/>
+              </w:rPr>
+              <w:t>Named and authorized health IT/FHIR partner evidence is required.</w:t>
+            </w:r>
+          </w:p>
+        </w:tc>
+      </w:tr>
+      <w:tr>
+        <w:trPr>
+          <w:cantSplit w:val="true"/>
+        </w:trPr>
+        <w:tc>
+          <w:tcPr>
+            <w:tcW w:type="dxa" w:w="3120"/>
+            <w:tcMar>
+              <w:top w:w="90" w:type="dxa"/>
+              <w:start w:w="110" w:type="dxa"/>
+              <w:bottom w:w="90" w:type="dxa"/>
+              <w:end w:w="110" w:type="dxa"/>
+            </w:tcMar>
+            <w:vAlign w:val="center"/>
+            <w:shd w:fill="F9FBFC"/>
+          </w:tcPr>
+          <w:p>
+            <w:pPr>
+              <w:spacing w:after="0" w:line="240" w:lineRule="auto"/>
+            </w:pPr>
+            <w:r>
+              <w:rPr>
+                <w:rFonts w:ascii="Times New Roman" w:hAnsi="Times New Roman"/>
+                <w:sz w:val="24"/>
+              </w:rPr>
+              <w:t>HHS ATO, FIPS 199, SSP/control implementation, and 3PAO coordination</w:t>
+            </w:r>
+          </w:p>
+        </w:tc>
+        <w:tc>
+          <w:tcPr>
+            <w:tcW w:type="dxa" w:w="3120"/>
+            <w:tcMar>
+              <w:top w:w="90" w:type="dxa"/>
+              <w:start w:w="110" w:type="dxa"/>
+              <w:bottom w:w="90" w:type="dxa"/>
+              <w:end w:w="110" w:type="dxa"/>
+            </w:tcMar>
+            <w:vAlign w:val="center"/>
+            <w:shd w:fill="F9FBFC"/>
+          </w:tcPr>
+          <w:p>
+            <w:pPr>
+              <w:spacing w:after="0" w:line="240" w:lineRule="auto"/>
+            </w:pPr>
+            <w:r>
+              <w:rPr>
+                <w:rFonts w:ascii="Times New Roman" w:hAnsi="Times New Roman"/>
+                <w:sz w:val="24"/>
+              </w:rPr>
+              <w:t>No direct LumenCore HHS authorization reference is claimed.</w:t>
+            </w:r>
+          </w:p>
+        </w:tc>
+        <w:tc>
+          <w:tcPr>
+            <w:tcW w:type="dxa" w:w="3120"/>
+            <w:tcMar>
+              <w:top w:w="90" w:type="dxa"/>
+              <w:start w:w="110" w:type="dxa"/>
+              <w:bottom w:w="90" w:type="dxa"/>
+              <w:end w:w="110" w:type="dxa"/>
+            </w:tcMar>
+            <w:vAlign w:val="center"/>
+            <w:shd w:fill="F9FBFC"/>
+          </w:tcPr>
+          <w:p>
+            <w:pPr>
+              <w:spacing w:after="0" w:line="240" w:lineRule="auto"/>
+            </w:pPr>
+            <w:r>
+              <w:rPr>
+                <w:rFonts w:ascii="Times New Roman" w:hAnsi="Times New Roman"/>
+                <w:sz w:val="24"/>
+              </w:rPr>
+              <w:t>Named and authorized federal cybersecurity lead and independent assessment path are required.</w:t>
+            </w:r>
+          </w:p>
+        </w:tc>
+      </w:tr>
+      <w:tr>
+        <w:trPr>
+          <w:cantSplit w:val="true"/>
+        </w:trPr>
+        <w:tc>
+          <w:tcPr>
+            <w:tcW w:type="dxa" w:w="3120"/>
+            <w:tcMar>
+              <w:top w:w="90" w:type="dxa"/>
+              <w:start w:w="110" w:type="dxa"/>
+              <w:bottom w:w="90" w:type="dxa"/>
+              <w:end w:w="110" w:type="dxa"/>
+            </w:tcMar>
+            <w:vAlign w:val="center"/>
+          </w:tcPr>
+          <w:p>
+            <w:pPr>
+              <w:spacing w:after="0" w:line="240" w:lineRule="auto"/>
+            </w:pPr>
+            <w:r>
+              <w:rPr>
+                <w:rFonts w:ascii="Times New Roman" w:hAnsi="Times New Roman"/>
+                <w:sz w:val="24"/>
+              </w:rPr>
+              <w:t>Full-scope federal health program integration</w:t>
+            </w:r>
+          </w:p>
+        </w:tc>
+        <w:tc>
+          <w:tcPr>
+            <w:tcW w:type="dxa" w:w="3120"/>
+            <w:tcMar>
+              <w:top w:w="90" w:type="dxa"/>
+              <w:start w:w="110" w:type="dxa"/>
+              <w:bottom w:w="90" w:type="dxa"/>
+              <w:end w:w="110" w:type="dxa"/>
+            </w:tcMar>
+            <w:vAlign w:val="center"/>
+          </w:tcPr>
+          <w:p>
+            <w:pPr>
+              <w:spacing w:after="0" w:line="240" w:lineRule="auto"/>
+            </w:pPr>
+            <w:r>
+              <w:rPr>
+                <w:rFonts w:ascii="Times New Roman" w:hAnsi="Times New Roman"/>
+                <w:sz w:val="24"/>
+              </w:rPr>
+              <w:t>No full-prime readiness or comparable federal health delivery is claimed.</w:t>
+            </w:r>
+          </w:p>
+        </w:tc>
+        <w:tc>
+          <w:tcPr>
+            <w:tcW w:type="dxa" w:w="3120"/>
+            <w:tcMar>
+              <w:top w:w="90" w:type="dxa"/>
+              <w:start w:w="110" w:type="dxa"/>
+              <w:bottom w:w="90" w:type="dxa"/>
+              <w:end w:w="110" w:type="dxa"/>
+            </w:tcMar>
+            <w:vAlign w:val="center"/>
+          </w:tcPr>
+          <w:p>
+            <w:pPr>
+              <w:spacing w:after="0" w:line="240" w:lineRule="auto"/>
+            </w:pPr>
+            <w:r>
+              <w:rPr>
+                <w:rFonts w:ascii="Times New Roman" w:hAnsi="Times New Roman"/>
+                <w:sz w:val="24"/>
+              </w:rPr>
+              <w:t>A qualified small-business prime or integrated team must own program delivery and provide relevant references.</w:t>
             </w:r>
           </w:p>
         </w:tc>

</xml_diff>

<commit_message>
Harden Argos standalone response and dispatch gates
</commit_message>
<xml_diff>
--- a/grant_submissions/ONC_ARGOS_20260730/output/ARGOS_PARTNER_FIRST_CAPABILITY_RESPONSE_DRAFT.docx
+++ b/grant_submissions/ONC_ARGOS_20260730/output/ARGOS_PARTNER_FIRST_CAPABILITY_RESPONSE_DRAFT.docx
@@ -69,7 +69,7 @@
           <w:color w:val="52606B"/>
           <w:sz w:val="24"/>
         </w:rPr>
-        <w:t>LUMAARC SEAL OF APPROVAL</w:t>
+        <w:t>LUMAARC BRAND MARK</w:t>
       </w:r>
     </w:p>
     <w:p>
@@ -335,7 +335,7 @@
                 <w:rFonts w:ascii="Times New Roman" w:hAnsi="Times New Roman"/>
                 <w:sz w:val="24"/>
               </w:rPr>
-              <w:t>Seal</w:t>
+              <w:t>UEI / DUNS if applicable</w:t>
             </w:r>
           </w:p>
         </w:tc>
@@ -360,7 +360,7 @@
                 <w:rFonts w:ascii="Times New Roman" w:hAnsi="Times New Roman"/>
                 <w:sz w:val="24"/>
               </w:rPr>
-              <w:t>LumaArc seal of approval</w:t>
+              <w:t>Pending action-time fact</w:t>
             </w:r>
           </w:p>
         </w:tc>
@@ -389,7 +389,7 @@
                 <w:rFonts w:ascii="Times New Roman" w:hAnsi="Times New Roman"/>
                 <w:sz w:val="24"/>
               </w:rPr>
-              <w:t>UEI / DUNS if applicable</w:t>
+              <w:t>Company address</w:t>
             </w:r>
           </w:p>
         </w:tc>
@@ -443,7 +443,7 @@
                 <w:rFonts w:ascii="Times New Roman" w:hAnsi="Times New Roman"/>
                 <w:sz w:val="24"/>
               </w:rPr>
-              <w:t>Company address</w:t>
+              <w:t>Authorized point of contact</w:t>
             </w:r>
           </w:p>
         </w:tc>
@@ -497,7 +497,7 @@
                 <w:rFonts w:ascii="Times New Roman" w:hAnsi="Times New Roman"/>
                 <w:sz w:val="24"/>
               </w:rPr>
-              <w:t>Authorized point of contact</w:t>
+              <w:t>Telephone / email</w:t>
             </w:r>
           </w:p>
         </w:tc>
@@ -551,7 +551,7 @@
                 <w:rFonts w:ascii="Times New Roman" w:hAnsi="Times New Roman"/>
                 <w:sz w:val="24"/>
               </w:rPr>
-              <w:t>Telephone / email</w:t>
+              <w:t>Small-business designation(s)</w:t>
             </w:r>
           </w:p>
         </w:tc>
@@ -605,168 +605,6 @@
                 <w:rFonts w:ascii="Times New Roman" w:hAnsi="Times New Roman"/>
                 <w:sz w:val="24"/>
               </w:rPr>
-              <w:t>Small-business designation(s)</w:t>
-            </w:r>
-          </w:p>
-        </w:tc>
-        <w:tc>
-          <w:tcPr>
-            <w:tcW w:type="dxa" w:w="4680"/>
-            <w:tcMar>
-              <w:top w:w="90" w:type="dxa"/>
-              <w:start w:w="110" w:type="dxa"/>
-              <w:bottom w:w="90" w:type="dxa"/>
-              <w:end w:w="110" w:type="dxa"/>
-            </w:tcMar>
-            <w:vAlign w:val="center"/>
-          </w:tcPr>
-          <w:p>
-            <w:pPr>
-              <w:spacing w:after="0" w:line="240" w:lineRule="auto"/>
-            </w:pPr>
-            <w:r>
-              <w:rPr>
-                <w:rFonts w:ascii="Times New Roman" w:hAnsi="Times New Roman"/>
-                <w:sz w:val="24"/>
-              </w:rPr>
-              <w:t>Pending action-time fact</w:t>
-            </w:r>
-          </w:p>
-        </w:tc>
-      </w:tr>
-      <w:tr>
-        <w:trPr>
-          <w:cantSplit w:val="true"/>
-        </w:trPr>
-        <w:tc>
-          <w:tcPr>
-            <w:tcW w:type="dxa" w:w="4680"/>
-            <w:tcMar>
-              <w:top w:w="90" w:type="dxa"/>
-              <w:start w:w="110" w:type="dxa"/>
-              <w:bottom w:w="90" w:type="dxa"/>
-              <w:end w:w="110" w:type="dxa"/>
-            </w:tcMar>
-            <w:vAlign w:val="center"/>
-            <w:shd w:fill="F9FBFC"/>
-          </w:tcPr>
-          <w:p>
-            <w:pPr>
-              <w:spacing w:after="0" w:line="240" w:lineRule="auto"/>
-            </w:pPr>
-            <w:r>
-              <w:rPr>
-                <w:rFonts w:ascii="Times New Roman" w:hAnsi="Times New Roman"/>
-                <w:sz w:val="24"/>
-              </w:rPr>
-              <w:t>Public reviewer surface</w:t>
-            </w:r>
-          </w:p>
-        </w:tc>
-        <w:tc>
-          <w:tcPr>
-            <w:tcW w:type="dxa" w:w="4680"/>
-            <w:tcMar>
-              <w:top w:w="90" w:type="dxa"/>
-              <w:start w:w="110" w:type="dxa"/>
-              <w:bottom w:w="90" w:type="dxa"/>
-              <w:end w:w="110" w:type="dxa"/>
-            </w:tcMar>
-            <w:vAlign w:val="center"/>
-            <w:shd w:fill="F9FBFC"/>
-          </w:tcPr>
-          <w:p>
-            <w:pPr>
-              <w:spacing w:after="0" w:line="240" w:lineRule="auto"/>
-            </w:pPr>
-            <w:r>
-              <w:rPr>
-                <w:rFonts w:ascii="Times New Roman" w:hAnsi="Times New Roman"/>
-                <w:sz w:val="24"/>
-              </w:rPr>
-              <w:t>https://lumen-core.ai/</w:t>
-            </w:r>
-          </w:p>
-        </w:tc>
-      </w:tr>
-      <w:tr>
-        <w:trPr>
-          <w:cantSplit w:val="true"/>
-        </w:trPr>
-        <w:tc>
-          <w:tcPr>
-            <w:tcW w:type="dxa" w:w="4680"/>
-            <w:tcMar>
-              <w:top w:w="90" w:type="dxa"/>
-              <w:start w:w="110" w:type="dxa"/>
-              <w:bottom w:w="90" w:type="dxa"/>
-              <w:end w:w="110" w:type="dxa"/>
-            </w:tcMar>
-            <w:vAlign w:val="center"/>
-          </w:tcPr>
-          <w:p>
-            <w:pPr>
-              <w:spacing w:after="0" w:line="240" w:lineRule="auto"/>
-            </w:pPr>
-            <w:r>
-              <w:rPr>
-                <w:rFonts w:ascii="Times New Roman" w:hAnsi="Times New Roman"/>
-                <w:sz w:val="24"/>
-              </w:rPr>
-              <w:t>Public evidence repository</w:t>
-            </w:r>
-          </w:p>
-        </w:tc>
-        <w:tc>
-          <w:tcPr>
-            <w:tcW w:type="dxa" w:w="4680"/>
-            <w:tcMar>
-              <w:top w:w="90" w:type="dxa"/>
-              <w:start w:w="110" w:type="dxa"/>
-              <w:bottom w:w="90" w:type="dxa"/>
-              <w:end w:w="110" w:type="dxa"/>
-            </w:tcMar>
-            <w:vAlign w:val="center"/>
-          </w:tcPr>
-          <w:p>
-            <w:pPr>
-              <w:spacing w:after="0" w:line="240" w:lineRule="auto"/>
-            </w:pPr>
-            <w:r>
-              <w:rPr>
-                <w:rFonts w:ascii="Times New Roman" w:hAnsi="Times New Roman"/>
-                <w:sz w:val="24"/>
-              </w:rPr>
-              <w:t>https://github.com/robertashworth1986-debug/lumen-core-public</w:t>
-            </w:r>
-          </w:p>
-        </w:tc>
-      </w:tr>
-      <w:tr>
-        <w:trPr>
-          <w:cantSplit w:val="true"/>
-        </w:trPr>
-        <w:tc>
-          <w:tcPr>
-            <w:tcW w:type="dxa" w:w="4680"/>
-            <w:tcMar>
-              <w:top w:w="90" w:type="dxa"/>
-              <w:start w:w="110" w:type="dxa"/>
-              <w:bottom w:w="90" w:type="dxa"/>
-              <w:end w:w="110" w:type="dxa"/>
-            </w:tcMar>
-            <w:vAlign w:val="center"/>
-            <w:shd w:fill="F9FBFC"/>
-          </w:tcPr>
-          <w:p>
-            <w:pPr>
-              <w:spacing w:after="0" w:line="240" w:lineRule="auto"/>
-            </w:pPr>
-            <w:r>
-              <w:rPr>
-                <w:rFonts w:ascii="Times New Roman" w:hAnsi="Times New Roman"/>
-                <w:sz w:val="24"/>
-              </w:rPr>
               <w:t>Response deadline</w:t>
             </w:r>
           </w:p>
@@ -781,7 +619,6 @@
               <w:end w:w="110" w:type="dxa"/>
             </w:tcMar>
             <w:vAlign w:val="center"/>
-            <w:shd w:fill="F9FBFC"/>
           </w:tcPr>
           <w:p>
             <w:pPr>
@@ -854,7 +691,7 @@
           <w:i w:val="0"/>
           <w:sz w:val="24"/>
         </w:rPr>
-        <w:t>LumenCore offers Project Argos a bounded evidence-assurance and deterministic-validation workstream: authorized-source custody, rule traceability, hash-locked evidence cases, human decision gates, adverse-result retention, and reviewer handoff. These are component capabilities supported by the public LumenCore repository and public reviewer surface.</w:t>
+        <w:t>Based on named first-party software artifacts, LumenCore can demonstrate source-artifact custody, versioned rule execution, evidence-package assembly, human approval gates, adverse-result retention, and reproducible reviewer handoff. Evidence packages are accompanied by SHA-256 integrity manifests. These are bounded component capabilities, not comparable federal-health past performance.</w:t>
       </w:r>
     </w:p>
     <w:p>
@@ -868,7 +705,7 @@
           <w:i w:val="0"/>
           <w:sz w:val="24"/>
         </w:rPr>
-        <w:t>For Project Argos, those patterns align most directly with requirements traceability, public-source ingestion provenance, deterministic validator orchestration, evidence-case generation, corrective-action retest records, and production handoff documentation. LumenCore is responding at component level and does not claim presently qualified full-scope health IT prime readiness. A credible team still requires named FHIR R4/CHPL and ONC Certification Program expertise plus an HHS ATO/FIPS 199/security lead.</w:t>
+        <w:t>For Project Argos, those patterns align most directly with requirements traceability, public-source ingestion provenance, deterministic validator orchestration, evidence-case generation, corrective-action retest records, and production handoff documentation. LumenCore is responding at component level and does not claim presently qualified full-scope health IT prime readiness, FHIR R4 conformance authority, HHS ATO leadership, or an evaluated health-domain deployment.</w:t>
       </w:r>
     </w:p>
     <w:tbl>
@@ -904,7 +741,7 @@
                 <w:b/>
                 <w:sz w:val="24"/>
               </w:rPr>
-              <w:t>Recommended acquisition position: bounded evidence-assurance workstream participant in a named team. Full-prime readiness is not claimed.</w:t>
+              <w:t>Response posture: bounded small-business component capability. LumenCore is the sole respondent; no outside team is proposed; full-prime readiness is not claimed.</w:t>
             </w:r>
           </w:p>
         </w:tc>
@@ -1007,7 +844,7 @@
           <w:color w:val="17222B"/>
           <w:sz w:val="24"/>
         </w:rPr>
-        <w:t>3. Task-by-Task Capability and Teaming Matrix</w:t>
+        <w:t>3. Task-by-Task Capability and Gap Matrix</w:t>
       </w:r>
     </w:p>
     <w:p>
@@ -1021,7 +858,7 @@
           <w:i w:val="0"/>
           <w:sz w:val="24"/>
         </w:rPr>
-        <w:t>The matrix distinguishes current evidence-backed contribution from work that must be led or accepted by qualified health IT, regulatory, cybersecurity, prime, and Government personnel.</w:t>
+        <w:t>The matrix distinguishes current first-party component capability from work that has not been demonstrated. It does not assign any task to an unnamed partner or represent another organization's authority.</w:t>
       </w:r>
     </w:p>
     <w:tbl>
@@ -1223,7 +1060,7 @@
                 <w:rFonts w:ascii="Times New Roman" w:hAnsi="Times New Roman"/>
                 <w:sz w:val="24"/>
               </w:rPr>
-              <w:t>Core contribution with partner review</w:t>
+              <w:t>Partial capability</w:t>
             </w:r>
           </w:p>
         </w:tc>
@@ -1248,7 +1085,7 @@
                 <w:rFonts w:ascii="Times New Roman" w:hAnsi="Times New Roman"/>
                 <w:sz w:val="24"/>
               </w:rPr>
-              <w:t>Build a versioned requirements-to-test-to-evidence matrix; define evidence identifiers, severity fields, human checkpoints, decision rights, schedules, and change-control receipts. A health-regulatory lead must approve mappings to 45 CFR and ONC program practice.</w:t>
+              <w:t>Build a versioned requirements-to-test-to-evidence matrix with evidence IDs, severity, human checkpoints, schedules, and change control. No complete 45 CFR or CHPL mapping or authorized regulatory interpretation is claimed.</w:t>
             </w:r>
           </w:p>
         </w:tc>
@@ -1325,7 +1162,7 @@
                 <w:rFonts w:ascii="Times New Roman" w:hAnsi="Times New Roman"/>
                 <w:sz w:val="24"/>
               </w:rPr>
-              <w:t>Core contribution</w:t>
+              <w:t>Partial capability</w:t>
             </w:r>
           </w:p>
         </w:tc>
@@ -1349,7 +1186,7 @@
                 <w:rFonts w:ascii="Times New Roman" w:hAnsi="Times New Roman"/>
                 <w:sz w:val="24"/>
               </w:rPr>
-              <w:t>Produce source-backed status reports with task progress, blockers, expected completion dates, evidence links, decisions, and unresolved gates.</w:t>
+              <w:t>Produce source-backed status, blockers, milestones, event timelines, evidence IDs, decisions, and unresolved gates. Comparable HHS reporting performance is not claimed.</w:t>
             </w:r>
           </w:p>
         </w:tc>
@@ -1429,7 +1266,7 @@
                 <w:rFonts w:ascii="Times New Roman" w:hAnsi="Times New Roman"/>
                 <w:sz w:val="24"/>
               </w:rPr>
-              <w:t>Core contribution with FHIR partner</w:t>
+              <w:t>Partial capability</w:t>
             </w:r>
           </w:p>
         </w:tc>
@@ -1454,7 +1291,7 @@
                 <w:rFonts w:ascii="Times New Roman" w:hAnsi="Times New Roman"/>
                 <w:sz w:val="24"/>
               </w:rPr>
-              <w:t>Implement source inventory, raw-response custody, timestamps, request metadata, hashes, lineage, precedence rules, data dictionaries, and reproducible normalized projections. Partner validates CHPL, Lantern, NPPES, and FHIR domain mappings.</w:t>
+              <w:t>Implement source inventory, raw-response custody, timestamps, headers, hashes, lineage, precedence, dictionaries, and normalized projections. CHPL, Lantern, NPPES, and FHIR connectors are not demonstrated.</w:t>
             </w:r>
           </w:p>
         </w:tc>
@@ -1531,7 +1368,7 @@
                 <w:rFonts w:ascii="Times New Roman" w:hAnsi="Times New Roman"/>
                 <w:sz w:val="24"/>
               </w:rPr>
-              <w:t>Core contribution with security partner</w:t>
+              <w:t>Partial capability</w:t>
             </w:r>
           </w:p>
         </w:tc>
@@ -1555,7 +1392,7 @@
                 <w:rFonts w:ascii="Times New Roman" w:hAnsi="Times New Roman"/>
                 <w:sz w:val="24"/>
               </w:rPr>
-              <w:t>Separate deterministic validators from AI support; version policies, prompts, rules, retries, rate limits, fallbacks, error handling, and audit logs; require human authorization for compliance determinations.</w:t>
+              <w:t>Separate deterministic validators from AI support; version policies, prompts, rules, retries, fallbacks, and audit logs; require human compliance decisions. No deployed health-domain architecture or secure HHS boundary is demonstrated.</w:t>
             </w:r>
           </w:p>
         </w:tc>
@@ -1635,7 +1472,7 @@
                 <w:rFonts w:ascii="Times New Roman" w:hAnsi="Times New Roman"/>
                 <w:sz w:val="24"/>
               </w:rPr>
-              <w:t>Partner-led</w:t>
+              <w:t>Not demonstrated</w:t>
             </w:r>
           </w:p>
         </w:tc>
@@ -1660,7 +1497,7 @@
                 <w:rFonts w:ascii="Times New Roman" w:hAnsi="Times New Roman"/>
                 <w:sz w:val="24"/>
               </w:rPr>
-              <w:t>LumenCore can wrap validator outputs in traceable evidence cases and regression receipts. A qualified FHIR/ONC partner must own standards interpretation, test design, and conformance acceptance.</w:t>
+              <w:t>Package supplied validator outputs as traceable evidence cases and regression receipts. No FHIR R4 test authority, quarterly operation, publication-failure detection, or conformance acceptance is claimed.</w:t>
             </w:r>
           </w:p>
         </w:tc>
@@ -1737,7 +1574,7 @@
                 <w:rFonts w:ascii="Times New Roman" w:hAnsi="Times New Roman"/>
                 <w:sz w:val="24"/>
               </w:rPr>
-              <w:t>Partner-led with evidence support</w:t>
+              <w:t>Not demonstrated</w:t>
             </w:r>
           </w:p>
         </w:tc>
@@ -1761,7 +1598,7 @@
                 <w:rFonts w:ascii="Times New Roman" w:hAnsi="Times New Roman"/>
                 <w:sz w:val="24"/>
               </w:rPr>
-              <w:t>Contribute safe-observation logging, scope controls, drift records, hashes, and replayable comparison artifacts. Partner owns health-endpoint semantics, Government-approved access boundaries, and PHI avoidance controls.</w:t>
+              <w:t>Contribute safe-observation logs, scope controls, drift records, hashes, and replay. Health-endpoint semantics, capability-sufficiency tests, published-versus-observed comparison, and approved access are not demonstrated.</w:t>
             </w:r>
           </w:p>
         </w:tc>
@@ -1841,7 +1678,7 @@
                 <w:rFonts w:ascii="Times New Roman" w:hAnsi="Times New Roman"/>
                 <w:sz w:val="24"/>
               </w:rPr>
-              <w:t>Core contribution</w:t>
+              <w:t>Strongest partial capability</w:t>
             </w:r>
           </w:p>
         </w:tc>
@@ -1866,7 +1703,7 @@
                 <w:rFonts w:ascii="Times New Roman" w:hAnsi="Times New Roman"/>
                 <w:sz w:val="24"/>
               </w:rPr>
-              <w:t>Assemble raw and normalized artifacts, validator output, request/response logs, timestamps, hashes, severity, rule traceability, issue narratives, deduplication keys, and machine/human-readable exports.</w:t>
+              <w:t>Assemble raw and normalized artifacts, logs, timestamps, hashes, severity, rule traceability, narratives, deduplication, screenshots, clustering, and human/machine exports. A designated HHS-system export remains unproven.</w:t>
             </w:r>
           </w:p>
         </w:tc>
@@ -1943,7 +1780,7 @@
                 <w:rFonts w:ascii="Times New Roman" w:hAnsi="Times New Roman"/>
                 <w:sz w:val="24"/>
               </w:rPr>
-              <w:t>Core contribution with regulatory approval</w:t>
+              <w:t>Partial capability</w:t>
             </w:r>
           </w:p>
         </w:tc>
@@ -1967,7 +1804,7 @@
                 <w:rFonts w:ascii="Times New Roman" w:hAnsi="Times New Roman"/>
                 <w:sz w:val="24"/>
               </w:rPr>
-              <w:t>Provide controlled draft, review, authorization, retest, and before/after evidence workflows. ONC/ONC-ACB discretion and regulatory interpretation stay with authorized personnel.</w:t>
+              <w:t>Provide controlled drafting, review, authorization, retest, before/after evidence, and recurrence fields. No ONC/ONC-ACB discretion or regulatory interpretation authority is claimed.</w:t>
             </w:r>
           </w:p>
         </w:tc>
@@ -2047,7 +1884,7 @@
                 <w:rFonts w:ascii="Times New Roman" w:hAnsi="Times New Roman"/>
                 <w:sz w:val="24"/>
               </w:rPr>
-              <w:t>Security-partner-led</w:t>
+              <w:t>Not demonstrated</w:t>
             </w:r>
           </w:p>
         </w:tc>
@@ -2072,7 +1909,7 @@
                 <w:rFonts w:ascii="Times New Roman" w:hAnsi="Times New Roman"/>
                 <w:sz w:val="24"/>
               </w:rPr>
-              <w:t>LumenCore can supply component inventories, reproducibility records, change receipts, evidence links, and control-test artifacts. The team requires an experienced HHS ATO/FIPS 199/SSP lead and authorized assessment support.</w:t>
+              <w:t>Supply component inventories, reproducibility and change receipts, evidence IDs, and control-test artifacts. No HHS ATO lead, FIPS 199/SSP delivery, 3PAO coordination, milestone reporting, or authorization package is claimed.</w:t>
             </w:r>
           </w:p>
         </w:tc>
@@ -2149,7 +1986,7 @@
                 <w:rFonts w:ascii="Times New Roman" w:hAnsi="Times New Roman"/>
                 <w:sz w:val="24"/>
               </w:rPr>
-              <w:t>Core contribution with prime</w:t>
+              <w:t>Partial capability</w:t>
             </w:r>
           </w:p>
         </w:tc>
@@ -2173,7 +2010,7 @@
                 <w:rFonts w:ascii="Times New Roman" w:hAnsi="Times New Roman"/>
                 <w:sz w:val="24"/>
               </w:rPr>
-              <w:t>Package code, dependency locks, manifests, runbooks, rollback procedures, limitations, test coverage, operating assumptions, costs, staffing needs, and reviewer receipts. Hosting and production acceptance remain prime/Government decisions.</w:t>
+              <w:t>Package code, dependency locks, manifests, runbooks, rollback, limitations, tests, assumptions, costs, staffing, and reviewer receipts. No HHS-deployable package, hosting approval, or production acceptance is demonstrated.</w:t>
             </w:r>
           </w:p>
         </w:tc>
@@ -2253,7 +2090,7 @@
                 <w:rFonts w:ascii="Times New Roman" w:hAnsi="Times New Roman"/>
                 <w:sz w:val="24"/>
               </w:rPr>
-              <w:t>Core contribution with domain partner</w:t>
+              <w:t>Partial capability</w:t>
             </w:r>
           </w:p>
         </w:tc>
@@ -2278,7 +2115,7 @@
                 <w:rFonts w:ascii="Times New Roman" w:hAnsi="Times New Roman"/>
                 <w:sz w:val="24"/>
               </w:rPr>
-              <w:t>Extend the same traceability and evidence-case pattern to approved public documentation checks, prototype scoring only under locked criteria, and retain uncertainty and adverse findings in expansion recommendations.</w:t>
+              <w:t>Apply traceability to approved public-document checks and locked prototype scoring. EHI/API criteria, controlling regulatory citations, and a validated FY 2027 strategy are not demonstrated.</w:t>
             </w:r>
           </w:p>
         </w:tc>
@@ -2491,7 +2328,7 @@
           <w:i w:val="0"/>
           <w:sz w:val="24"/>
         </w:rPr>
-        <w:t>The following public records support the engineering patterns offered here. They are not presented as healthcare, agency, field, or economic validation.</w:t>
+        <w:t>The following named first-party records support the engineering patterns offered here and are available for authorized review after repository security screening. They are not presented as healthcare, agency, field, or economic validation.</w:t>
       </w:r>
     </w:p>
     <w:tbl>
@@ -2560,7 +2397,7 @@
                 <w:b/>
                 <w:sz w:val="24"/>
               </w:rPr>
-              <w:t>What the public artifact supports</w:t>
+              <w:t>What the record supports</w:t>
             </w:r>
           </w:p>
         </w:tc>
@@ -2616,7 +2453,7 @@
                 <w:rFonts w:ascii="Times New Roman" w:hAnsi="Times New Roman"/>
                 <w:sz w:val="24"/>
               </w:rPr>
-              <w:t>Public reviewer capsule</w:t>
+              <w:t>First-party reproducibility package</w:t>
             </w:r>
           </w:p>
         </w:tc>
@@ -2641,7 +2478,7 @@
                 <w:rFonts w:ascii="Times New Roman" w:hAnsi="Times New Roman"/>
                 <w:sz w:val="24"/>
               </w:rPr>
-              <w:t>31 of 31 declared assertions and 3 of 3 suites reproduced in the packaged clean-run workflow, with dependency and source-state checks.</w:t>
+              <w:t>A named package and SHA-256 receipt record successful execution of its declared checks under an identified source state.</w:t>
             </w:r>
           </w:p>
         </w:tc>
@@ -2798,7 +2635,7 @@
                 <w:rFonts w:ascii="Times New Roman" w:hAnsi="Times New Roman"/>
                 <w:sz w:val="24"/>
               </w:rPr>
-              <w:t>Public records preserve failed promotion gates, negative findings, and unresolved authorities instead of converting them into favorable claims.</w:t>
+              <w:t>Named first-party records preserve failed promotion gates, negative findings, and unresolved authorities instead of converting them into favorable claims.</w:t>
             </w:r>
           </w:p>
         </w:tc>
@@ -2845,7 +2682,7 @@
           <w:i w:val="0"/>
           <w:sz w:val="24"/>
         </w:rPr>
-        <w:t>The notice requests experience of similar scope and complexity. The matrix below distinguishes LumenCore component evidence from qualifications that must come from an authorized team; it does not substitute adjacent technical work for federal health prior performance.</w:t>
+        <w:t>The notice requests experience of similar scope and complexity. The matrix below distinguishes LumenCore component evidence from material qualifications that are not demonstrated; it does not substitute adjacent technical work for federal health prior performance.</w:t>
       </w:r>
     </w:p>
     <w:tbl>
@@ -2995,7 +2832,7 @@
                 <w:rFonts w:ascii="Times New Roman" w:hAnsi="Times New Roman"/>
                 <w:sz w:val="24"/>
               </w:rPr>
-              <w:t>Component pattern supported by public code, tests, receipts, and reviewer artifacts.</w:t>
+              <w:t>Component pattern supported by named first-party code, tests, receipts, and reviewer artifacts.</w:t>
             </w:r>
           </w:p>
         </w:tc>
@@ -3020,7 +2857,7 @@
                 <w:rFonts w:ascii="Times New Roman" w:hAnsi="Times New Roman"/>
                 <w:sz w:val="24"/>
               </w:rPr>
-              <w:t>LumenCore can be evaluated for a bounded evidence-assurance workstream.</w:t>
+              <w:t>Available for authorized review after repository security screening.</w:t>
             </w:r>
           </w:p>
         </w:tc>
@@ -3097,7 +2934,7 @@
                 <w:rFonts w:ascii="Times New Roman" w:hAnsi="Times New Roman"/>
                 <w:sz w:val="24"/>
               </w:rPr>
-              <w:t>Named and authorized health IT/FHIR partner evidence is required.</w:t>
+              <w:t>Future acquisition staffing or separately authorized teaming would be required; no outside team is proposed in this response.</w:t>
             </w:r>
           </w:p>
         </w:tc>
@@ -3177,7 +3014,7 @@
                 <w:rFonts w:ascii="Times New Roman" w:hAnsi="Times New Roman"/>
                 <w:sz w:val="24"/>
               </w:rPr>
-              <w:t>Named and authorized federal cybersecurity lead and independent assessment path are required.</w:t>
+              <w:t>Future acquisition staffing or separately authorized teaming would be required; no ATO lead or assessor is proposed in this response.</w:t>
             </w:r>
           </w:p>
         </w:tc>
@@ -3254,7 +3091,7 @@
                 <w:rFonts w:ascii="Times New Roman" w:hAnsi="Times New Roman"/>
                 <w:sz w:val="24"/>
               </w:rPr>
-              <w:t>A qualified small-business prime or integrated team must own program delivery and provide relevant references.</w:t>
+              <w:t>LumenCore should not be treated as a presently qualified full-scope prime.</w:t>
             </w:r>
           </w:p>
         </w:tc>
@@ -3276,7 +3113,7 @@
           <w:i/>
           <w:sz w:val="24"/>
         </w:rPr>
-        <w:t>The public evidence index states the present boundary directly: current strengths are artifact custody, deterministic replay, fail-closed claim governance, reviewer handoff packaging, and bounded pilot design. Independent scientific validation, field-validated savings, agency endorsement, certified safety, audited revenue, and customer adoption require separately identified external records.</w:t>
+        <w:t>The internal evidence index states the present boundary directly: current strengths are artifact custody, deterministic replay, fail-closed claim governance, reviewer handoff packaging, and bounded pilot design. Independent scientific validation, field-validated savings, agency endorsement, certified safety, audited revenue, and customer adoption require separately identified external records.</w:t>
       </w:r>
     </w:p>
     <w:p>
@@ -3361,7 +3198,7 @@
           <w:i w:val="0"/>
           <w:sz w:val="24"/>
         </w:rPr>
-        <w:t>Current boundary: the public repository is not an HHS-authorized production system and does not establish an ATO, FHIR certification, 3PAO assessment, or federal health deployment. Those are explicit team and acquisition gates.</w:t>
+        <w:t>Current boundary: the cited first-party artifacts are not an HHS-authorized production system and do not establish an ATO, FHIR certification, 3PAO assessment, or federal health deployment. Those remain acquisition and authorization gaps.</w:t>
       </w:r>
     </w:p>
     <w:p>
@@ -3376,7 +3213,7 @@
           <w:color w:val="17222B"/>
           <w:sz w:val="24"/>
         </w:rPr>
-        <w:t>7. Teaming Structure and Missing Qualifications</w:t>
+        <w:t>7. Standalone Response and Capability Gaps</w:t>
       </w:r>
     </w:p>
     <w:tbl>
@@ -3419,7 +3256,7 @@
                 <w:b/>
                 <w:sz w:val="24"/>
               </w:rPr>
-              <w:t>Workstream</w:t>
+              <w:t>Area</w:t>
             </w:r>
           </w:p>
         </w:tc>
@@ -3445,7 +3282,7 @@
                 <w:b/>
                 <w:sz w:val="24"/>
               </w:rPr>
-              <w:t>Accountability</w:t>
+              <w:t>Required or relevant capability</w:t>
             </w:r>
           </w:p>
         </w:tc>
@@ -3471,7 +3308,7 @@
                 <w:b/>
                 <w:sz w:val="24"/>
               </w:rPr>
-              <w:t>Current gate</w:t>
+              <w:t>Current status</w:t>
             </w:r>
           </w:p>
         </w:tc>
@@ -3501,7 +3338,7 @@
                 <w:rFonts w:ascii="Times New Roman" w:hAnsi="Times New Roman"/>
                 <w:sz w:val="24"/>
               </w:rPr>
-              <w:t>LumenCore evidence-assurance workstream</w:t>
+              <w:t>Response posture</w:t>
             </w:r>
           </w:p>
         </w:tc>
@@ -3526,7 +3363,7 @@
                 <w:rFonts w:ascii="Times New Roman" w:hAnsi="Times New Roman"/>
                 <w:sz w:val="24"/>
               </w:rPr>
-              <w:t>Source custody, deterministic validation orchestration, traceability, evidence cases, hashes, claim boundaries, reviewer packages, retest receipts.</w:t>
+              <w:t>LumenCore is the sole respondent. No teaming arrangement, joint venture, or subcontracting relationship is proposed.</w:t>
             </w:r>
           </w:p>
         </w:tc>
@@ -3551,7 +3388,7 @@
                 <w:rFonts w:ascii="Times New Roman" w:hAnsi="Times New Roman"/>
                 <w:sz w:val="24"/>
               </w:rPr>
-              <w:t>Public repository evidence supports bounded reproducibility patterns.</w:t>
+              <w:t>No external proposed team members exist to identify.</w:t>
             </w:r>
           </w:p>
         </w:tc>
@@ -3580,7 +3417,7 @@
                 <w:rFonts w:ascii="Times New Roman" w:hAnsi="Times New Roman"/>
                 <w:sz w:val="24"/>
               </w:rPr>
-              <w:t>Health IT/FHIR and ONC program lead</w:t>
+              <w:t>Health IT/FHIR and ONC program authority</w:t>
             </w:r>
           </w:p>
         </w:tc>
@@ -3628,7 +3465,7 @@
                 <w:rFonts w:ascii="Times New Roman" w:hAnsi="Times New Roman"/>
                 <w:sz w:val="24"/>
               </w:rPr>
-              <w:t>Pending named and authorized partner</w:t>
+              <w:t>Capability gap disclosed; no person or organization is represented.</w:t>
             </w:r>
           </w:p>
         </w:tc>
@@ -3658,7 +3495,7 @@
                 <w:rFonts w:ascii="Times New Roman" w:hAnsi="Times New Roman"/>
                 <w:sz w:val="24"/>
               </w:rPr>
-              <w:t>Federal cybersecurity/ATO lead</w:t>
+              <w:t>Federal cybersecurity/ATO authority</w:t>
             </w:r>
           </w:p>
         </w:tc>
@@ -3708,7 +3545,7 @@
                 <w:rFonts w:ascii="Times New Roman" w:hAnsi="Times New Roman"/>
                 <w:sz w:val="24"/>
               </w:rPr>
-              <w:t>Pending named and authorized partner</w:t>
+              <w:t>Capability gap disclosed; no person or organization is represented.</w:t>
             </w:r>
           </w:p>
         </w:tc>
@@ -3737,7 +3574,7 @@
                 <w:rFonts w:ascii="Times New Roman" w:hAnsi="Times New Roman"/>
                 <w:sz w:val="24"/>
               </w:rPr>
-              <w:t>Prime/program integration lead</w:t>
+              <w:t>Comparable full-program delivery</w:t>
             </w:r>
           </w:p>
         </w:tc>
@@ -3785,7 +3622,7 @@
                 <w:rFonts w:ascii="Times New Roman" w:hAnsi="Times New Roman"/>
                 <w:sz w:val="24"/>
               </w:rPr>
-              <w:t>Pending named and authorized partner</w:t>
+              <w:t>Not demonstrated and not claimed.</w:t>
             </w:r>
           </w:p>
         </w:tc>
@@ -3807,7 +3644,7 @@
           <w:i/>
           <w:sz w:val="24"/>
         </w:rPr>
-        <w:t>No partner name, credential, contract vehicle, clearance, prior-performance reference, or legal designation will be included without authorization and documentary support at action time.</w:t>
+        <w:t>Teaming status as of submission: LumenCore has not formed or been authorized to represent a team for this response. No other organization or individual is proposed as a team member. The rows above identify capability gaps, not proposed or committed team members. LumenCore is open to future acquisition or teaming discussions, but this response does not represent another organization's commitment, qualifications, past performance, or authority.</w:t>
       </w:r>
     </w:p>
     <w:p>
@@ -3959,7 +3796,7 @@
                 <w:rFonts w:ascii="Times New Roman" w:hAnsi="Times New Roman"/>
                 <w:sz w:val="24"/>
               </w:rPr>
-              <w:t>Confirm team, scope, source authorization, regulatory ownership, hosting assumptions, traceability schema, security boundary, and pilot cohort.</w:t>
+              <w:t>Confirm scope, source authorization, regulatory ownership, hosting assumptions, traceability schema, security boundary, and pilot cohort.</w:t>
             </w:r>
           </w:p>
         </w:tc>
@@ -4227,7 +4064,7 @@
           <w:rFonts w:ascii="Times New Roman" w:hAnsi="Times New Roman"/>
           <w:sz w:val="24"/>
         </w:rPr>
-        <w:t>Is HHS seeking one full-scope prime, or would it value clearly bounded small-business teaming responses for evidence assurance, FHIR validation, and ATO workstreams?</w:t>
+        <w:t>Which deliverables define the minimum viable first acquisition phase, and may HHS evaluate a bounded small-business contribution separately from full-scope prime readiness?</w:t>
       </w:r>
     </w:p>
     <w:p>
@@ -4262,7 +4099,7 @@
           <w:i w:val="0"/>
           <w:sz w:val="24"/>
         </w:rPr>
-        <w:t>Requested next step: include LumenCore in market-research or teaming discussions where a qualified prime needs an inspectable evidence-assurance workstream for source custody, deterministic validators, rule traceability, human-gated issue disposition, and reproducible handoff.</w:t>
+        <w:t>For acquisition planning, HHS may treat this response as evidence of bounded small-business capacity in evidence management and validation orchestration. If HHS conducts follow-up market research, LumenCore is available to demonstrate the cited artifacts and answer technical questions.</w:t>
       </w:r>
     </w:p>
     <w:p>

</xml_diff>